<commit_message>
Finalize submission package: embed figure captions in reports, add print layouts, shapefiles, and QGIS console runs
</commit_message>
<xml_diff>
--- a/Laporan_UAS_GIS_E504.docx
+++ b/Laporan_UAS_GIS_E504.docx
@@ -2,7 +2,7 @@
 <file path=word/document.xml><?xml version="1.0" encoding="utf-8"?>
 <w:document xmlns:w="http://schemas.openxmlformats.org/wordprocessingml/2006/main" xmlns:m="http://schemas.openxmlformats.org/officeDocument/2006/math" xmlns:r="http://schemas.openxmlformats.org/officeDocument/2006/relationships" xmlns:o="urn:schemas-microsoft-com:office:office" xmlns:v="urn:schemas-microsoft-com:vml" xmlns:w10="urn:schemas-microsoft-com:office:word" xmlns:a="http://schemas.openxmlformats.org/drawingml/2006/main" xmlns:pic="http://schemas.openxmlformats.org/drawingml/2006/picture" xmlns:wp="http://schemas.openxmlformats.org/drawingml/2006/wordprocessingDrawing">
   <w:body>
-    <w:bookmarkStart w:id="45" w:name="laporan-ujian-akhir-semester-uas"/>
+    <w:bookmarkStart w:id="53" w:name="laporan-ujian-akhir-semester-uas"/>
     <w:p>
       <w:pPr>
         <w:pStyle w:val="Heading1"/>
@@ -1044,14 +1044,14 @@
       <w:r>
         <w:drawing>
           <wp:inline>
-            <wp:extent cx="5334000" cy="2815802"/>
+            <wp:extent cx="5334000" cy="2647532"/>
             <wp:effectExtent b="0" l="0" r="0" t="0"/>
             <wp:docPr descr="Screenshot 1: Tampilan Penuh WebGIS &amp; Legenda" title="" id="28" name="Picture"/>
             <a:graphic>
               <a:graphicData uri="http://schemas.openxmlformats.org/drawingml/2006/picture">
                 <pic:pic>
                   <pic:nvPicPr>
-                    <pic:cNvPr descr="/home/tgrwjya/Documents/Uni/Semester%206/DATA/GIS/UAS/screenshot1.png" id="29" name="Picture"/>
+                    <pic:cNvPr descr="/home/tgrwjya/Documents/Uni/Semester%206/DATA/GIS/UAS/screenshot/screenshot1.png" id="29" name="Picture"/>
                     <pic:cNvPicPr>
                       <a:picLocks noChangeArrowheads="1" noChangeAspect="1"/>
                     </pic:cNvPicPr>
@@ -1065,7 +1065,7 @@
                   <pic:spPr bwMode="auto">
                     <a:xfrm>
                       <a:off x="0" y="0"/>
-                      <a:ext cx="5334000" cy="2815802"/>
+                      <a:ext cx="5334000" cy="2647532"/>
                     </a:xfrm>
                     <a:prstGeom prst="rect">
                       <a:avLst/>
@@ -1083,6 +1083,16 @@
           </wp:inline>
         </w:drawing>
       </w:r>
+      <w:r>
+        <w:t xml:space="preserve"> </w:t>
+      </w:r>
+      <w:r>
+        <w:rPr>
+          <w:iCs/>
+          <w:i/>
+        </w:rPr>
+        <w:t xml:space="preserve">Gambar 1.1: Tampilan Peta Interaktif WebGIS Aksesibilitas Perguruan Tinggi Jabodetabek</w:t>
+      </w:r>
     </w:p>
     <w:p>
       <w:pPr>
@@ -1104,14 +1114,14 @@
       <w:r>
         <w:drawing>
           <wp:inline>
-            <wp:extent cx="5334000" cy="2815802"/>
+            <wp:extent cx="5334000" cy="2651712"/>
             <wp:effectExtent b="0" l="0" r="0" t="0"/>
             <wp:docPr descr="Screenshot 2: Tampilan Pop-up Atribut Kampus" title="" id="31" name="Picture"/>
             <a:graphic>
               <a:graphicData uri="http://schemas.openxmlformats.org/drawingml/2006/picture">
                 <pic:pic>
                   <pic:nvPicPr>
-                    <pic:cNvPr descr="/home/tgrwjya/Documents/Uni/Semester%206/DATA/GIS/UAS/screenshot2.png" id="32" name="Picture"/>
+                    <pic:cNvPr descr="/home/tgrwjya/Documents/Uni/Semester%206/DATA/GIS/UAS/screenshot/screenshot2.png" id="32" name="Picture"/>
                     <pic:cNvPicPr>
                       <a:picLocks noChangeArrowheads="1" noChangeAspect="1"/>
                     </pic:cNvPicPr>
@@ -1125,7 +1135,7 @@
                   <pic:spPr bwMode="auto">
                     <a:xfrm>
                       <a:off x="0" y="0"/>
-                      <a:ext cx="5334000" cy="2815802"/>
+                      <a:ext cx="5334000" cy="2651712"/>
                     </a:xfrm>
                     <a:prstGeom prst="rect">
                       <a:avLst/>
@@ -1143,6 +1153,16 @@
           </wp:inline>
         </w:drawing>
       </w:r>
+      <w:r>
+        <w:t xml:space="preserve"> </w:t>
+      </w:r>
+      <w:r>
+        <w:rPr>
+          <w:iCs/>
+          <w:i/>
+        </w:rPr>
+        <w:t xml:space="preserve">Gambar 1.2: Tampilan Pop-up Atribut Detail Kampus (Kalbis Institute)</w:t>
+      </w:r>
     </w:p>
     <w:p>
       <w:r>
@@ -1154,7 +1174,7 @@
     <w:bookmarkEnd w:id="33"/>
     <w:bookmarkEnd w:id="34"/>
     <w:bookmarkEnd w:id="35"/>
-    <w:bookmarkStart w:id="44" w:name="X8585b6567324206a11a6932169c48d52f819669"/>
+    <w:bookmarkStart w:id="52" w:name="X8585b6567324206a11a6932169c48d52f819669"/>
     <w:p>
       <w:pPr>
         <w:pStyle w:val="Heading2"/>
@@ -1587,7 +1607,7 @@
       </w:r>
     </w:p>
     <w:bookmarkEnd w:id="36"/>
-    <w:bookmarkStart w:id="40" w:name="Xae8fcad76b0a5f1f4bb25eaa63ad0223055b817"/>
+    <w:bookmarkStart w:id="44" w:name="Xae8fcad76b0a5f1f4bb25eaa63ad0223055b817"/>
     <w:p>
       <w:pPr>
         <w:pStyle w:val="Heading3"/>
@@ -3669,6 +3689,73 @@
         <w:t xml:space="preserve">Hal ini menjawab hipotesis awal bahwa keberadaan pasokan calon mahasiswa (input demografis) di suatu kecamatan dinilai lebih kritis oleh model dibandingkan hanya kedekatan dengan kawasan industri mitra, meskipun keduanya merupakan komponen dominan (total kontribusi &gt; 68%).</w:t>
       </w:r>
     </w:p>
+    <w:bookmarkEnd w:id="39"/>
+    <w:bookmarkStart w:id="43" w:name="bukti-eksekusi-qgis-python-console"/>
+    <w:p>
+      <w:pPr>
+        <w:pStyle w:val="Heading4"/>
+      </w:pPr>
+      <w:r>
+        <w:t xml:space="preserve">Bukti Eksekusi QGIS Python Console:</w:t>
+      </w:r>
+    </w:p>
+    <w:p>
+      <w:pPr>
+        <w:pStyle w:val="FirstParagraph"/>
+      </w:pPr>
+      <w:r>
+        <w:drawing>
+          <wp:inline>
+            <wp:extent cx="5334000" cy="4536868"/>
+            <wp:effectExtent b="0" l="0" r="0" t="0"/>
+            <wp:docPr descr="Bukti Eksekusi QGIS Python Console" title="" id="41" name="Picture"/>
+            <a:graphic>
+              <a:graphicData uri="http://schemas.openxmlformats.org/drawingml/2006/picture">
+                <pic:pic>
+                  <pic:nvPicPr>
+                    <pic:cNvPr descr="/home/tgrwjya/Documents/Uni/Semester%206/DATA/GIS/UAS/screenshot/Screenshot%20from%202026-07-19%2017-54-38.png" id="42" name="Picture"/>
+                    <pic:cNvPicPr>
+                      <a:picLocks noChangeArrowheads="1" noChangeAspect="1"/>
+                    </pic:cNvPicPr>
+                  </pic:nvPicPr>
+                  <pic:blipFill>
+                    <a:blip r:embed="rId40"/>
+                    <a:stretch>
+                      <a:fillRect/>
+                    </a:stretch>
+                  </pic:blipFill>
+                  <pic:spPr bwMode="auto">
+                    <a:xfrm>
+                      <a:off x="0" y="0"/>
+                      <a:ext cx="5334000" cy="4536868"/>
+                    </a:xfrm>
+                    <a:prstGeom prst="rect">
+                      <a:avLst/>
+                    </a:prstGeom>
+                    <a:noFill/>
+                    <a:ln w="9525">
+                      <a:noFill/>
+                      <a:headEnd/>
+                      <a:tailEnd/>
+                    </a:ln>
+                  </pic:spPr>
+                </pic:pic>
+              </a:graphicData>
+            </a:graphic>
+          </wp:inline>
+        </w:drawing>
+      </w:r>
+      <w:r>
+        <w:t xml:space="preserve"> </w:t>
+      </w:r>
+      <w:r>
+        <w:rPr>
+          <w:iCs/>
+          <w:i/>
+        </w:rPr>
+        <w:t xml:space="preserve">Gambar 2.1: Bukti Eksekusi Pemodelan Spasial Random Forest pada QGIS Python Console</w:t>
+      </w:r>
+    </w:p>
     <w:p>
       <w:r>
         <w:pict>
@@ -3676,9 +3763,9 @@
         </w:pict>
       </w:r>
     </w:p>
-    <w:bookmarkEnd w:id="39"/>
-    <w:bookmarkEnd w:id="40"/>
-    <w:bookmarkStart w:id="43" w:name="bagian-c-pemetaan-hasil-kesimpulan"/>
+    <w:bookmarkEnd w:id="43"/>
+    <w:bookmarkEnd w:id="44"/>
+    <w:bookmarkStart w:id="51" w:name="bagian-c-pemetaan-hasil-kesimpulan"/>
     <w:p>
       <w:pPr>
         <w:pStyle w:val="Heading3"/>
@@ -3687,7 +3774,7 @@
         <w:t xml:space="preserve">Bagian C: Pemetaan Hasil &amp; Kesimpulan</w:t>
       </w:r>
     </w:p>
-    <w:bookmarkStart w:id="42" w:name="X24d3364fa41e2a89e661c65866fbd017b8c8664"/>
+    <w:bookmarkStart w:id="46" w:name="X24d3364fa41e2a89e661c65866fbd017b8c8664"/>
     <w:p>
       <w:pPr>
         <w:pStyle w:val="Heading4"/>
@@ -3725,7 +3812,7 @@
       <w:r>
         <w:t xml:space="preserve"> </w:t>
       </w:r>
-      <w:hyperlink r:id="rId41">
+      <w:hyperlink r:id="rId45">
         <w:r>
           <w:rPr>
             <w:rStyle w:val="Hyperlink"/>
@@ -4295,10 +4382,77 @@
         <w:t xml:space="preserve">. Peta QGIS kini menampilkan zonasi kelayakan lokasi pembangunan kampus satelit secara intuitif.</w:t>
       </w:r>
     </w:p>
-    <w:bookmarkEnd w:id="42"/>
-    <w:bookmarkEnd w:id="43"/>
-    <w:bookmarkEnd w:id="44"/>
-    <w:bookmarkEnd w:id="45"/>
+    <w:bookmarkEnd w:id="46"/>
+    <w:bookmarkStart w:id="50" w:name="peta-hasil-cetak-qgis-print-layout"/>
+    <w:p>
+      <w:pPr>
+        <w:pStyle w:val="Heading4"/>
+      </w:pPr>
+      <w:r>
+        <w:t xml:space="preserve">Peta Hasil Cetak (QGIS Print Layout):</w:t>
+      </w:r>
+    </w:p>
+    <w:p>
+      <w:pPr>
+        <w:pStyle w:val="FirstParagraph"/>
+      </w:pPr>
+      <w:r>
+        <w:drawing>
+          <wp:inline>
+            <wp:extent cx="5334000" cy="4121727"/>
+            <wp:effectExtent b="0" l="0" r="0" t="0"/>
+            <wp:docPr descr="Peta Cetak Layout QGIS" title="" id="48" name="Picture"/>
+            <a:graphic>
+              <a:graphicData uri="http://schemas.openxmlformats.org/drawingml/2006/picture">
+                <pic:pic>
+                  <pic:nvPicPr>
+                    <pic:cNvPr descr="/home/tgrwjya/Documents/Uni/Semester%206/DATA/GIS/UAS/screenshot/Peta%20Rekomendasi%20Lokasi%20Kampus%20Satelit%20Baru%20Berbasis%20Machine%20Learning%20Print%20Layout.png" id="49" name="Picture"/>
+                    <pic:cNvPicPr>
+                      <a:picLocks noChangeArrowheads="1" noChangeAspect="1"/>
+                    </pic:cNvPicPr>
+                  </pic:nvPicPr>
+                  <pic:blipFill>
+                    <a:blip r:embed="rId47"/>
+                    <a:stretch>
+                      <a:fillRect/>
+                    </a:stretch>
+                  </pic:blipFill>
+                  <pic:spPr bwMode="auto">
+                    <a:xfrm>
+                      <a:off x="0" y="0"/>
+                      <a:ext cx="5334000" cy="4121727"/>
+                    </a:xfrm>
+                    <a:prstGeom prst="rect">
+                      <a:avLst/>
+                    </a:prstGeom>
+                    <a:noFill/>
+                    <a:ln w="9525">
+                      <a:noFill/>
+                      <a:headEnd/>
+                      <a:tailEnd/>
+                    </a:ln>
+                  </pic:spPr>
+                </pic:pic>
+              </a:graphicData>
+            </a:graphic>
+          </wp:inline>
+        </w:drawing>
+      </w:r>
+      <w:r>
+        <w:t xml:space="preserve"> </w:t>
+      </w:r>
+      <w:r>
+        <w:rPr>
+          <w:iCs/>
+          <w:i/>
+        </w:rPr>
+        <w:t xml:space="preserve">Gambar 2.2: Peta Hasil Klasifikasi Kelayakan Lokasi Kampus Satelit Baru (Output QGIS Print Layout)</w:t>
+      </w:r>
+    </w:p>
+    <w:bookmarkEnd w:id="50"/>
+    <w:bookmarkEnd w:id="51"/>
+    <w:bookmarkEnd w:id="52"/>
+    <w:bookmarkEnd w:id="53"/>
     <w:sectPr/>
   </w:body>
 </w:document>

</xml_diff>

<commit_message>
Finalize submission: add GitHub repository and script citations in the academic reports
</commit_message>
<xml_diff>
--- a/Laporan_UAS_GIS_E504.docx
+++ b/Laporan_UAS_GIS_E504.docx
@@ -2,7 +2,7 @@
 <file path=word/document.xml><?xml version="1.0" encoding="utf-8"?>
 <w:document xmlns:w="http://schemas.openxmlformats.org/wordprocessingml/2006/main" xmlns:m="http://schemas.openxmlformats.org/officeDocument/2006/math" xmlns:r="http://schemas.openxmlformats.org/officeDocument/2006/relationships" xmlns:o="urn:schemas-microsoft-com:office:office" xmlns:v="urn:schemas-microsoft-com:vml" xmlns:w10="urn:schemas-microsoft-com:office:word" xmlns:a="http://schemas.openxmlformats.org/drawingml/2006/main" xmlns:pic="http://schemas.openxmlformats.org/drawingml/2006/picture" xmlns:wp="http://schemas.openxmlformats.org/drawingml/2006/wordprocessingDrawing">
   <w:body>
-    <w:bookmarkStart w:id="53" w:name="laporan-ujian-akhir-semester-uas"/>
+    <w:bookmarkStart w:id="58" w:name="laporan-ujian-akhir-semester-uas"/>
     <w:p>
       <w:pPr>
         <w:pStyle w:val="Heading1"/>
@@ -249,7 +249,7 @@
       </w:r>
     </w:p>
     <w:bookmarkEnd w:id="20"/>
-    <w:bookmarkStart w:id="35" w:name="X12c1bafc75ec1051137618100b90cadfd86a0a8"/>
+    <w:bookmarkStart w:id="36" w:name="X12c1bafc75ec1051137618100b90cadfd86a0a8"/>
     <w:p>
       <w:pPr>
         <w:pStyle w:val="Heading2"/>
@@ -765,7 +765,7 @@
       </w:r>
     </w:p>
     <w:bookmarkEnd w:id="24"/>
-    <w:bookmarkStart w:id="34" w:name="Xea30490345e18e63bc2fbb3bb32ed2c35b85e21"/>
+    <w:bookmarkStart w:id="35" w:name="Xea30490345e18e63bc2fbb3bb32ed2c35b85e21"/>
     <w:p>
       <w:pPr>
         <w:pStyle w:val="Heading3"/>
@@ -823,7 +823,7 @@
         <w:t xml:space="preserve">.</w:t>
       </w:r>
     </w:p>
-    <w:bookmarkStart w:id="26" w:name="fitur-utama-dashboard"/>
+    <w:bookmarkStart w:id="27" w:name="fitur-utama-dashboard"/>
     <w:p>
       <w:pPr>
         <w:pStyle w:val="Heading4"/>
@@ -1014,8 +1014,38 @@
         </w:r>
       </w:hyperlink>
     </w:p>
-    <w:bookmarkEnd w:id="26"/>
-    <w:bookmarkStart w:id="33" w:name="X080471a8737ad43201df926454eb7a6ec653309"/>
+    <w:p>
+      <w:pPr>
+        <w:numPr>
+          <w:ilvl w:val="0"/>
+          <w:numId w:val="1001"/>
+        </w:numPr>
+        <w:pStyle w:val="Compact"/>
+      </w:pPr>
+      <w:r>
+        <w:rPr>
+          <w:bCs/>
+          <w:b/>
+        </w:rPr>
+        <w:t xml:space="preserve">Repositori GitHub</w:t>
+      </w:r>
+      <w:r>
+        <w:t xml:space="preserve">: Seluruh berkas kode sumber WebGIS, data Shapefile, dan script pemrosesan di-host secara privat di:</w:t>
+      </w:r>
+      <w:r>
+        <w:t xml:space="preserve"> </w:t>
+      </w:r>
+      <w:hyperlink r:id="rId26">
+        <w:r>
+          <w:rPr>
+            <w:rStyle w:val="Hyperlink"/>
+          </w:rPr>
+          <w:t xml:space="preserve">https://github.com/tgr-wjya/uas-gis-e504</w:t>
+        </w:r>
+      </w:hyperlink>
+    </w:p>
+    <w:bookmarkEnd w:id="27"/>
+    <w:bookmarkStart w:id="34" w:name="X080471a8737ad43201df926454eb7a6ec653309"/>
     <w:p>
       <w:pPr>
         <w:pStyle w:val="Heading4"/>
@@ -1046,18 +1076,18 @@
           <wp:inline>
             <wp:extent cx="5334000" cy="2647532"/>
             <wp:effectExtent b="0" l="0" r="0" t="0"/>
-            <wp:docPr descr="Screenshot 1: Tampilan Penuh WebGIS &amp; Legenda" title="" id="28" name="Picture"/>
+            <wp:docPr descr="Screenshot 1: Tampilan Penuh WebGIS &amp; Legenda" title="" id="29" name="Picture"/>
             <a:graphic>
               <a:graphicData uri="http://schemas.openxmlformats.org/drawingml/2006/picture">
                 <pic:pic>
                   <pic:nvPicPr>
-                    <pic:cNvPr descr="/home/tgrwjya/Documents/Uni/Semester%206/DATA/GIS/UAS/screenshot/screenshot1.png" id="29" name="Picture"/>
+                    <pic:cNvPr descr="/home/tgrwjya/Documents/Uni/Semester%206/DATA/GIS/UAS/screenshot/screenshot1.png" id="30" name="Picture"/>
                     <pic:cNvPicPr>
                       <a:picLocks noChangeArrowheads="1" noChangeAspect="1"/>
                     </pic:cNvPicPr>
                   </pic:nvPicPr>
                   <pic:blipFill>
-                    <a:blip r:embed="rId27"/>
+                    <a:blip r:embed="rId28"/>
                     <a:stretch>
                       <a:fillRect/>
                     </a:stretch>
@@ -1116,18 +1146,18 @@
           <wp:inline>
             <wp:extent cx="5334000" cy="2651712"/>
             <wp:effectExtent b="0" l="0" r="0" t="0"/>
-            <wp:docPr descr="Screenshot 2: Tampilan Pop-up Atribut Kampus" title="" id="31" name="Picture"/>
+            <wp:docPr descr="Screenshot 2: Tampilan Pop-up Atribut Kampus" title="" id="32" name="Picture"/>
             <a:graphic>
               <a:graphicData uri="http://schemas.openxmlformats.org/drawingml/2006/picture">
                 <pic:pic>
                   <pic:nvPicPr>
-                    <pic:cNvPr descr="/home/tgrwjya/Documents/Uni/Semester%206/DATA/GIS/UAS/screenshot/screenshot2.png" id="32" name="Picture"/>
+                    <pic:cNvPr descr="/home/tgrwjya/Documents/Uni/Semester%206/DATA/GIS/UAS/screenshot/screenshot2.png" id="33" name="Picture"/>
                     <pic:cNvPicPr>
                       <a:picLocks noChangeArrowheads="1" noChangeAspect="1"/>
                     </pic:cNvPicPr>
                   </pic:nvPicPr>
                   <pic:blipFill>
-                    <a:blip r:embed="rId30"/>
+                    <a:blip r:embed="rId31"/>
                     <a:stretch>
                       <a:fillRect/>
                     </a:stretch>
@@ -1171,10 +1201,10 @@
         </w:pict>
       </w:r>
     </w:p>
-    <w:bookmarkEnd w:id="33"/>
     <w:bookmarkEnd w:id="34"/>
     <w:bookmarkEnd w:id="35"/>
-    <w:bookmarkStart w:id="52" w:name="X8585b6567324206a11a6932169c48d52f819669"/>
+    <w:bookmarkEnd w:id="36"/>
+    <w:bookmarkStart w:id="57" w:name="X8585b6567324206a11a6932169c48d52f819669"/>
     <w:p>
       <w:pPr>
         <w:pStyle w:val="Heading2"/>
@@ -1183,7 +1213,7 @@
         <w:t xml:space="preserve">SOAL 2: Sistem Rekomendasi Lokasi Pembangunan Kampus Satelit Berbasis Machine Learning (Random Forest)</w:t>
       </w:r>
     </w:p>
-    <w:bookmarkStart w:id="36" w:name="X35198808093e8cf1b134c46debd941d2f5170b4"/>
+    <w:bookmarkStart w:id="41" w:name="X35198808093e8cf1b134c46debd941d2f5170b4"/>
     <w:p>
       <w:pPr>
         <w:pStyle w:val="Heading3"/>
@@ -1599,6 +1629,72 @@
         <w:t xml:space="preserve">: Luas total wilayah kecamatan (km²).</w:t>
       </w:r>
     </w:p>
+    <w:bookmarkStart w:id="40" w:name="X26f69d2a6b74bcd7ffcf7c321cef4a1d6bedfdb"/>
+    <w:p>
+      <w:pPr>
+        <w:pStyle w:val="Heading4"/>
+      </w:pPr>
+      <w:r>
+        <w:t xml:space="preserve">Bukti Eksekusi Prosedur Feature Engineering di QGIS Console:</w:t>
+      </w:r>
+    </w:p>
+    <w:p>
+      <w:pPr>
+        <w:pStyle w:val="FirstParagraph"/>
+      </w:pPr>
+      <w:r>
+        <w:drawing>
+          <wp:inline>
+            <wp:extent cx="5334000" cy="2182240"/>
+            <wp:effectExtent b="0" l="0" r="0" t="0"/>
+            <wp:docPr descr="Bukti Eksekusi Prosedur Feature Engineering di QGIS Console" title="" id="38" name="Picture"/>
+            <a:graphic>
+              <a:graphicData uri="http://schemas.openxmlformats.org/drawingml/2006/picture">
+                <pic:pic>
+                  <pic:nvPicPr>
+                    <pic:cNvPr descr="/home/tgrwjya/Documents/Uni/Semester%206/DATA/GIS/UAS/screenshot/Screenshot%20from%202026-07-19%2018-51-45.png" id="39" name="Picture"/>
+                    <pic:cNvPicPr>
+                      <a:picLocks noChangeArrowheads="1" noChangeAspect="1"/>
+                    </pic:cNvPicPr>
+                  </pic:nvPicPr>
+                  <pic:blipFill>
+                    <a:blip r:embed="rId37"/>
+                    <a:stretch>
+                      <a:fillRect/>
+                    </a:stretch>
+                  </pic:blipFill>
+                  <pic:spPr bwMode="auto">
+                    <a:xfrm>
+                      <a:off x="0" y="0"/>
+                      <a:ext cx="5334000" cy="2182240"/>
+                    </a:xfrm>
+                    <a:prstGeom prst="rect">
+                      <a:avLst/>
+                    </a:prstGeom>
+                    <a:noFill/>
+                    <a:ln w="9525">
+                      <a:noFill/>
+                      <a:headEnd/>
+                      <a:tailEnd/>
+                    </a:ln>
+                  </pic:spPr>
+                </pic:pic>
+              </a:graphicData>
+            </a:graphic>
+          </wp:inline>
+        </w:drawing>
+      </w:r>
+      <w:r>
+        <w:t xml:space="preserve"> </w:t>
+      </w:r>
+      <w:r>
+        <w:rPr>
+          <w:iCs/>
+          <w:i/>
+        </w:rPr>
+        <w:t xml:space="preserve">Gambar 2.1: Bukti Eksekusi Script Pemrosesan Variabel Spasial di QGIS Python Console</w:t>
+      </w:r>
+    </w:p>
     <w:p>
       <w:r>
         <w:pict>
@@ -1606,8 +1702,9 @@
         </w:pict>
       </w:r>
     </w:p>
-    <w:bookmarkEnd w:id="36"/>
-    <w:bookmarkStart w:id="44" w:name="Xae8fcad76b0a5f1f4bb25eaa63ad0223055b817"/>
+    <w:bookmarkEnd w:id="40"/>
+    <w:bookmarkEnd w:id="41"/>
+    <w:bookmarkStart w:id="49" w:name="Xae8fcad76b0a5f1f4bb25eaa63ad0223055b817"/>
     <w:p>
       <w:pPr>
         <w:pStyle w:val="Heading3"/>
@@ -1639,7 +1736,7 @@
         <w:t xml:space="preserve">pada lingkungan Python.</w:t>
       </w:r>
     </w:p>
-    <w:bookmarkStart w:id="37" w:name="X03ffce0e2448cac56424927eb30adcb1bdc729f"/>
+    <w:bookmarkStart w:id="42" w:name="X03ffce0e2448cac56424927eb30adcb1bdc729f"/>
     <w:p>
       <w:pPr>
         <w:pStyle w:val="Heading4"/>
@@ -3240,8 +3337,8 @@
         <w:t xml:space="preserve">)</w:t>
       </w:r>
     </w:p>
-    <w:bookmarkEnd w:id="37"/>
-    <w:bookmarkStart w:id="38" w:name="metrik-evaluasi-model"/>
+    <w:bookmarkEnd w:id="42"/>
+    <w:bookmarkStart w:id="43" w:name="metrik-evaluasi-model"/>
     <w:p>
       <w:pPr>
         <w:pStyle w:val="Heading4"/>
@@ -3412,8 +3509,8 @@
         <w:t xml:space="preserve">(F1-Score = 0.86).</w:t>
       </w:r>
     </w:p>
-    <w:bookmarkEnd w:id="38"/>
-    <w:bookmarkStart w:id="39" w:name="analisis-feature-importance"/>
+    <w:bookmarkEnd w:id="43"/>
+    <w:bookmarkStart w:id="44" w:name="analisis-feature-importance"/>
     <w:p>
       <w:pPr>
         <w:pStyle w:val="Heading4"/>
@@ -3689,8 +3786,8 @@
         <w:t xml:space="preserve">Hal ini menjawab hipotesis awal bahwa keberadaan pasokan calon mahasiswa (input demografis) di suatu kecamatan dinilai lebih kritis oleh model dibandingkan hanya kedekatan dengan kawasan industri mitra, meskipun keduanya merupakan komponen dominan (total kontribusi &gt; 68%).</w:t>
       </w:r>
     </w:p>
-    <w:bookmarkEnd w:id="39"/>
-    <w:bookmarkStart w:id="43" w:name="bukti-eksekusi-qgis-python-console"/>
+    <w:bookmarkEnd w:id="44"/>
+    <w:bookmarkStart w:id="48" w:name="bukti-eksekusi-qgis-python-console"/>
     <w:p>
       <w:pPr>
         <w:pStyle w:val="Heading4"/>
@@ -3708,18 +3805,18 @@
           <wp:inline>
             <wp:extent cx="5334000" cy="4536868"/>
             <wp:effectExtent b="0" l="0" r="0" t="0"/>
-            <wp:docPr descr="Bukti Eksekusi QGIS Python Console" title="" id="41" name="Picture"/>
+            <wp:docPr descr="Bukti Eksekusi QGIS Python Console" title="" id="46" name="Picture"/>
             <a:graphic>
               <a:graphicData uri="http://schemas.openxmlformats.org/drawingml/2006/picture">
                 <pic:pic>
                   <pic:nvPicPr>
-                    <pic:cNvPr descr="/home/tgrwjya/Documents/Uni/Semester%206/DATA/GIS/UAS/screenshot/Screenshot%20from%202026-07-19%2017-54-38.png" id="42" name="Picture"/>
+                    <pic:cNvPr descr="/home/tgrwjya/Documents/Uni/Semester%206/DATA/GIS/UAS/screenshot/Screenshot%20from%202026-07-19%2017-54-38.png" id="47" name="Picture"/>
                     <pic:cNvPicPr>
                       <a:picLocks noChangeArrowheads="1" noChangeAspect="1"/>
                     </pic:cNvPicPr>
                   </pic:nvPicPr>
                   <pic:blipFill>
-                    <a:blip r:embed="rId40"/>
+                    <a:blip r:embed="rId45"/>
                     <a:stretch>
                       <a:fillRect/>
                     </a:stretch>
@@ -3753,7 +3850,7 @@
           <w:iCs/>
           <w:i/>
         </w:rPr>
-        <w:t xml:space="preserve">Gambar 2.1: Bukti Eksekusi Pemodelan Spasial Random Forest pada QGIS Python Console</w:t>
+        <w:t xml:space="preserve">Gambar 2.2: Bukti Eksekusi Pemodelan Spasial Random Forest pada QGIS Python Console</w:t>
       </w:r>
     </w:p>
     <w:p>
@@ -3763,9 +3860,9 @@
         </w:pict>
       </w:r>
     </w:p>
-    <w:bookmarkEnd w:id="43"/>
-    <w:bookmarkEnd w:id="44"/>
-    <w:bookmarkStart w:id="51" w:name="bagian-c-pemetaan-hasil-kesimpulan"/>
+    <w:bookmarkEnd w:id="48"/>
+    <w:bookmarkEnd w:id="49"/>
+    <w:bookmarkStart w:id="56" w:name="bagian-c-pemetaan-hasil-kesimpulan"/>
     <w:p>
       <w:pPr>
         <w:pStyle w:val="Heading3"/>
@@ -3774,7 +3871,7 @@
         <w:t xml:space="preserve">Bagian C: Pemetaan Hasil &amp; Kesimpulan</w:t>
       </w:r>
     </w:p>
-    <w:bookmarkStart w:id="46" w:name="X24d3364fa41e2a89e661c65866fbd017b8c8664"/>
+    <w:bookmarkStart w:id="51" w:name="X24d3364fa41e2a89e661c65866fbd017b8c8664"/>
     <w:p>
       <w:pPr>
         <w:pStyle w:val="Heading4"/>
@@ -3812,7 +3909,7 @@
       <w:r>
         <w:t xml:space="preserve"> </w:t>
       </w:r>
-      <w:hyperlink r:id="rId45">
+      <w:hyperlink r:id="rId50">
         <w:r>
           <w:rPr>
             <w:rStyle w:val="Hyperlink"/>
@@ -4382,8 +4479,8 @@
         <w:t xml:space="preserve">. Peta QGIS kini menampilkan zonasi kelayakan lokasi pembangunan kampus satelit secara intuitif.</w:t>
       </w:r>
     </w:p>
-    <w:bookmarkEnd w:id="46"/>
-    <w:bookmarkStart w:id="50" w:name="peta-hasil-cetak-qgis-print-layout"/>
+    <w:bookmarkEnd w:id="51"/>
+    <w:bookmarkStart w:id="55" w:name="peta-hasil-cetak-qgis-print-layout"/>
     <w:p>
       <w:pPr>
         <w:pStyle w:val="Heading4"/>
@@ -4401,18 +4498,18 @@
           <wp:inline>
             <wp:extent cx="5334000" cy="4121727"/>
             <wp:effectExtent b="0" l="0" r="0" t="0"/>
-            <wp:docPr descr="Peta Cetak Layout QGIS" title="" id="48" name="Picture"/>
+            <wp:docPr descr="Peta Cetak Layout QGIS" title="" id="53" name="Picture"/>
             <a:graphic>
               <a:graphicData uri="http://schemas.openxmlformats.org/drawingml/2006/picture">
                 <pic:pic>
                   <pic:nvPicPr>
-                    <pic:cNvPr descr="/home/tgrwjya/Documents/Uni/Semester%206/DATA/GIS/UAS/screenshot/Peta%20Rekomendasi%20Lokasi%20Kampus%20Satelit%20Baru%20Berbasis%20Machine%20Learning%20Print%20Layout.png" id="49" name="Picture"/>
+                    <pic:cNvPr descr="/home/tgrwjya/Documents/Uni/Semester%206/DATA/GIS/UAS/screenshot/Peta%20Rekomendasi%20Lokasi%20Kampus%20Satelit%20Baru%20Berbasis%20Machine%20Learning%20Print%20Layout.png" id="54" name="Picture"/>
                     <pic:cNvPicPr>
                       <a:picLocks noChangeArrowheads="1" noChangeAspect="1"/>
                     </pic:cNvPicPr>
                   </pic:nvPicPr>
                   <pic:blipFill>
-                    <a:blip r:embed="rId47"/>
+                    <a:blip r:embed="rId52"/>
                     <a:stretch>
                       <a:fillRect/>
                     </a:stretch>
@@ -4446,13 +4543,13 @@
           <w:iCs/>
           <w:i/>
         </w:rPr>
-        <w:t xml:space="preserve">Gambar 2.2: Peta Hasil Klasifikasi Kelayakan Lokasi Kampus Satelit Baru (Output QGIS Print Layout)</w:t>
-      </w:r>
-    </w:p>
-    <w:bookmarkEnd w:id="50"/>
-    <w:bookmarkEnd w:id="51"/>
-    <w:bookmarkEnd w:id="52"/>
-    <w:bookmarkEnd w:id="53"/>
+        <w:t xml:space="preserve">Gambar 2.3: Peta Hasil Klasifikasi Kelayakan Lokasi Kampus Satelit Baru (Output QGIS Print Layout)</w:t>
+      </w:r>
+    </w:p>
+    <w:bookmarkEnd w:id="55"/>
+    <w:bookmarkEnd w:id="56"/>
+    <w:bookmarkEnd w:id="57"/>
+    <w:bookmarkEnd w:id="58"/>
     <w:sectPr/>
   </w:body>
 </w:document>

</xml_diff>